<commit_message>
Update base Platform PM resume: align WFM impact to $17M canonical, correct FinAuto numbers
- Executive summary + WFM bullet: $9.6M → $17M (aligns to platform-level revenue canonical confirmed 2026-05-03)
- FinAuto bullet: 3.5M invoices / 80 supplier formats → 3M invoices / 320 supplier formats (self-consistent with the 5 → 320 supplier scale already cited in the same bullet)

Co-Authored-By: Claude Opus 4.7 (1M context) <noreply@anthropic.com>
</commit_message>
<xml_diff>
--- a/Ayesha Resume/Ayesha Base Platform PM.docx
+++ b/Ayesha Resume/Ayesha Base Platform PM.docx
@@ -80,7 +80,7 @@
         <w:rPr>
           <w:noProof/>
         </w:rPr>
-        <w:pict w14:anchorId="1425FBD8">
+        <w:pict w14:anchorId="414F5726">
           <v:rect id="_x0000_i1028" alt="" style="width:461pt;height:.05pt;mso-width-percent:0;mso-height-percent:0;mso-width-percent:0;mso-height-percent:0" o:hralign="center" o:hrstd="t" o:hr="t" fillcolor="#a0a0a0" stroked="f"/>
         </w:pict>
       </w:r>
@@ -127,7 +127,23 @@
           <w:sz w:val="18"/>
           <w:szCs w:val="18"/>
         </w:rPr>
-        <w:t>Results-driven Platform Product Manager building integration platforms, API products, and multi-stakeholder systems at Amazon and growth companies. Has expertise in platform architecture, API strategy, and cross-functional leadership with influence without authority. Scaled integration platform from 5 pilot users to 1,000+ active suppliers over 18 months while consolidating 5 legacy systems, achieving 90% onboarding time reduction and $9.6M yearly impact. Have a proven track record of designing reusable platform infrastructure that enables other products and teams to move faster.</w:t>
+        <w:t>Results-driven Platform Product Manager building integration platforms, API products, and multi-stakeholder systems at Amazon and growth companies. Has expertise in platform architecture, API strategy, and cross-functional leadership with influence without authority. Scaled integration platform from 5 pilot users to 1,000+ active suppliers over 18 months while consolidating 5 legacy systems, achieving 90% onboarding time reduction and $</w:t>
+      </w:r>
+      <w:r>
+        <w:rPr>
+          <w:rFonts w:ascii="Calibri" w:eastAsia="Calibri" w:hAnsi="Calibri" w:cs="Calibri"/>
+          <w:sz w:val="18"/>
+          <w:szCs w:val="18"/>
+        </w:rPr>
+        <w:t>17</w:t>
+      </w:r>
+      <w:r>
+        <w:rPr>
+          <w:rFonts w:ascii="Calibri" w:eastAsia="Calibri" w:hAnsi="Calibri" w:cs="Calibri"/>
+          <w:sz w:val="18"/>
+          <w:szCs w:val="18"/>
+        </w:rPr>
+        <w:t>M yearly impact. Have a proven track record of designing reusable platform infrastructure that enables other products and teams to move faster.</w:t>
       </w:r>
     </w:p>
     <w:p>
@@ -151,7 +167,7 @@
         <w:rPr>
           <w:noProof/>
         </w:rPr>
-        <w:pict w14:anchorId="0B050D48">
+        <w:pict w14:anchorId="3081BC23">
           <v:rect id="_x0000_i1027" alt="" style="width:461pt;height:.05pt;mso-width-percent:0;mso-height-percent:0;mso-width-percent:0;mso-height-percent:0" o:hralign="center" o:hrstd="t" o:hr="t" fillcolor="#a0a0a0" stroked="f"/>
         </w:pict>
       </w:r>
@@ -325,7 +341,7 @@
         <w:rPr>
           <w:noProof/>
         </w:rPr>
-        <w:pict w14:anchorId="3676482C">
+        <w:pict w14:anchorId="136F4FBE">
           <v:rect id="_x0000_i1026" alt="" style="width:459pt;height:.05pt;mso-width-percent:0;mso-height-percent:0;mso-width-percent:0;mso-height-percent:0" o:hralign="center" o:hrstd="t" o:hr="t" fillcolor="#a0a0a0" stroked="f"/>
         </w:pict>
       </w:r>
@@ -486,7 +502,23 @@
           <w:sz w:val="18"/>
           <w:szCs w:val="18"/>
         </w:rPr>
-        <w:t xml:space="preserve"> Led org-wide initiative with VP-level buy-in to build and scale integration platform from 5 pilot suppliers to 1,000+ active users over 18 months, consolidating Whole Foods Market’s (WFM) 5 legacy systems into Amazon’s centralized vendor portal. Designed 3-layer platform architecture (Presentation → Transformation → Data) with a custom API suite (Item Registration, Mapping Lookup, Bulk Sync), achieving onboarding time reduction (8 weeks → 7 days), an 80%+ platform adoption rate, and $9.6M of revenue impact. Platform framework adopted as template for future convergence initiatives.</w:t>
+        <w:t xml:space="preserve"> Led org-wide initiative with VP-level buy-in to build and scale integration platform from 5 pilot suppliers to 1,000+ active users over 18 months, consolidating Whole Foods Market’s (WFM) 5 legacy systems into Amazon’s centralized vendor portal. Designed 3-layer platform architecture (Presentation → Transformation → Data) with a custom API suite (Item Registration, Mapping Lookup, Bulk Sync), achieving onboarding time reduction (8 weeks → 7 days), an 80%+ platform adoption rate, and $</w:t>
+      </w:r>
+      <w:r>
+        <w:rPr>
+          <w:rFonts w:ascii="Calibri" w:eastAsia="Calibri" w:hAnsi="Calibri" w:cs="Calibri"/>
+          <w:sz w:val="18"/>
+          <w:szCs w:val="18"/>
+        </w:rPr>
+        <w:t>17</w:t>
+      </w:r>
+      <w:r>
+        <w:rPr>
+          <w:rFonts w:ascii="Calibri" w:eastAsia="Calibri" w:hAnsi="Calibri" w:cs="Calibri"/>
+          <w:sz w:val="18"/>
+          <w:szCs w:val="18"/>
+        </w:rPr>
+        <w:t>M of revenue impact. Platform framework adopted as template for future convergence initiatives.</w:t>
       </w:r>
     </w:p>
     <w:p>
@@ -582,7 +614,23 @@
           <w:sz w:val="18"/>
           <w:szCs w:val="18"/>
         </w:rPr>
-        <w:t xml:space="preserve"> Architected and shipped AI-powered document processing platform (OCR + ML) automating 3M+ annual invoices. Designed template-based platform architecture reducing problem scope from 3.5M invoices to 80 unique supplier formats, achieving 80%+ accuracy (vs. 75% manual baseline). Scaled platform from 5 → 320 suppliers, delivering $2M annual savings and 92% processing time reduction (48h → 4h).</w:t>
+        <w:t xml:space="preserve"> Architected and shipped AI-powered document processing platform (OCR + ML) automating 3M+ annual invoices. Designed template-based platform architecture reducing problem scope from 3M invoices to </w:t>
+      </w:r>
+      <w:r>
+        <w:rPr>
+          <w:rFonts w:ascii="Calibri" w:eastAsia="Calibri" w:hAnsi="Calibri" w:cs="Calibri"/>
+          <w:sz w:val="18"/>
+          <w:szCs w:val="18"/>
+        </w:rPr>
+        <w:t>320</w:t>
+      </w:r>
+      <w:r>
+        <w:rPr>
+          <w:rFonts w:ascii="Calibri" w:eastAsia="Calibri" w:hAnsi="Calibri" w:cs="Calibri"/>
+          <w:sz w:val="18"/>
+          <w:szCs w:val="18"/>
+        </w:rPr>
+        <w:t xml:space="preserve"> unique supplier formats, achieving 80%+ accuracy (vs. 75% manual baseline). Scaled platform from 5 → 320 suppliers, delivering $2M annual savings and 92% processing time reduction (48h → 4h).</w:t>
       </w:r>
     </w:p>
     <w:p>
@@ -874,7 +922,7 @@
         <w:rPr>
           <w:noProof/>
         </w:rPr>
-        <w:pict w14:anchorId="443EC7DC">
+        <w:pict w14:anchorId="05D11FDC">
           <v:rect id="_x0000_i1025" alt="" style="width:468pt;height:.05pt;mso-width-percent:0;mso-height-percent:0;mso-width-percent:0;mso-height-percent:0" o:hralign="center" o:hrstd="t" o:hr="t" fillcolor="#a0a0a0" stroked="f"/>
         </w:pict>
       </w:r>

</xml_diff>